<commit_message>
Checklist: mark submitted to JORS 2026-09-16
Status set to SUBMITTED (v0.6.0, release tag v0.6.0). Cover letter + five suggested
reviewers entered in the Comments-to-the-Editor box. The submitted zip stays frozen as
the record of what was sent; repo now tracks live status.

Co-Authored-By: Claude Opus 4.8 <noreply@anthropic.com>
</commit_message>
<xml_diff>
--- a/paper/SUBMISSION_CHECKLIST.docx
+++ b/paper/SUBMISSION_CHECKLIST.docx
@@ -16,6 +16,72 @@
         <w:pStyle w:val="FirstParagraph"/>
       </w:pPr>
       <w:r>
+        <w:rPr>
+          <w:b/>
+          <w:bCs/>
+        </w:rPr>
+        <w:t xml:space="preserve">STATUS: SUBMITTED to the Journal of Open Research Software (JORS) on 2026-09-16.</w:t>
+      </w:r>
+      <w:r>
+        <w:t xml:space="preserve"> </w:t>
+      </w:r>
+      <w:r>
+        <w:t xml:space="preserve">Version of</w:t>
+      </w:r>
+      <w:r>
+        <w:t xml:space="preserve"> </w:t>
+      </w:r>
+      <w:r>
+        <w:t xml:space="preserve">record v0.6.0 (release https://github.com/odinzen/hephaestus-mqmqa-public/releases/tag/v0.6.0).</w:t>
+      </w:r>
+      <w:r>
+        <w:t xml:space="preserve"> </w:t>
+      </w:r>
+      <w:r>
+        <w:t xml:space="preserve">Corresponding author Michael E. Bustamante (Odinzen LLC); second author Gabriel Bustamante.</w:t>
+      </w:r>
+      <w:r>
+        <w:t xml:space="preserve"> </w:t>
+      </w:r>
+      <w:r>
+        <w:t xml:space="preserve">Submission package: Bustamante_Hephaestus_JORS_submission_2026-09-09.zip (manuscript v0.6.0,</w:t>
+      </w:r>
+      <w:r>
+        <w:t xml:space="preserve"> </w:t>
+      </w:r>
+      <w:r>
+        <w:t xml:space="preserve">one-page cover letter, Highlights, Supplementary S1, 10 figures). Cover letter and five</w:t>
+      </w:r>
+      <w:r>
+        <w:t xml:space="preserve"> </w:t>
+      </w:r>
+      <w:r>
+        <w:t xml:space="preserve">suggested reviewers were entered in the JORS</w:t>
+      </w:r>
+      <w:r>
+        <w:t xml:space="preserve"> </w:t>
+      </w:r>
+      <w:r>
+        <w:t xml:space="preserve">“Comments to the Editor”</w:t>
+      </w:r>
+      <w:r>
+        <w:t xml:space="preserve"> </w:t>
+      </w:r>
+      <w:r>
+        <w:t xml:space="preserve">box. Now awaiting editor</w:t>
+      </w:r>
+      <w:r>
+        <w:t xml:space="preserve"> </w:t>
+      </w:r>
+      <w:r>
+        <w:t xml:space="preserve">assignment and peer review.</w:t>
+      </w:r>
+    </w:p>
+    <w:p>
+      <w:pPr>
+        <w:pStyle w:val="BodyText"/>
+      </w:pPr>
+      <w:r>
         <w:t xml:space="preserve">Updated 2026-09-09 (seventh pass, v0.6.0). The XTDB third-generation reader is now built and</w:t>
       </w:r>
       <w:r>
@@ -28,7 +94,7 @@
         <w:t xml:space="preserve"> </w:t>
       </w:r>
       <w:r>
-        <w:t xml:space="preserve">verified and citations renumbered, gates re-run green. Ready for the two submission clicks below.</w:t>
+        <w:t xml:space="preserve">verified and citations renumbered, gates re-run green.</w:t>
       </w:r>
     </w:p>
     <w:bookmarkStart w:id="2323" w:name="done-2026-09-09-seventh-pass---v0.6.0"/>
@@ -301,7 +367,13 @@
         </w:numPr>
       </w:pPr>
       <w:r>
-        <w:t xml:space="preserve">OPEN: the two submission clicks.</w:t>
+        <w:t xml:space="preserve">DONE (2026-09-16): submitted to JORS; cover letter + five suggested reviewers entered in the</w:t>
+      </w:r>
+      <w:r>
+        <w:t xml:space="preserve"> </w:t>
+      </w:r>
+      <w:r>
+        <w:t xml:space="preserve">Comments-to-the-Editor box. Next: editor assignment, then reviewer reports.</w:t>
       </w:r>
     </w:p>
     <w:bookmarkEnd w:id="2323"/>

</xml_diff>